<commit_message>
chore: Refactor and rename project from "docx-ray" to "xray-docx"
- Updated package name and references in pyproject.toml, scripts, and tests.
- Changed sample document text from "DOCX Ray" to "Xray DOCX".
- Removed obsolete configure_repo.sh script.
- Added new README.md for xray-docx CLI with installation and usage instructions.
- Introduced new CLI and server modules for local inspection of DOCX files.
- Implemented inspection logic in service.py, ensuring safety and compliance with OOXML standards.
- Updated tests to reflect new naming and functionality, ensuring all tests pass with the new structure.
</commit_message>
<xml_diff>
--- a/public/sample.docx
+++ b/public/sample.docx
@@ -12,7 +12,7 @@
     </w:p>
     <w:p>
       <w:r>
-        <w:t>Hello from DOCX Ray. This sentence lives inside a w:t text node.</w:t>
+        <w:t>Hello from Xray DOCX. This sentence lives inside a w:t text node.</w:t>
       </w:r>
     </w:p>
     <w:p>
@@ -134,7 +134,7 @@
       <w:pStyle w:val="Header"/>
     </w:pPr>
     <w:r>
-      <w:t>DOCX Ray sample header</w:t>
+      <w:t>Xray DOCX sample header</w:t>
     </w:r>
   </w:p>
 </w:hdr>

</xml_diff>